<commit_message>
Tambah 5 figure publikasi 300 DPI dan embed ke manuscript paper
</commit_message>
<xml_diff>
--- a/paper/manuscript/paper_jjcit.docx
+++ b/paper/manuscript/paper_jjcit.docx
@@ -2188,7 +2188,7 @@
           <w:i w:val="0"/>
           <w:sz w:val="22"/>
         </w:rPr>
-        <w:t>Figure 1 illustrates the time-series evolution of infected nodes across all four scenarios. The baseline scenario exhibits a rapid initial rise in infections, peaking around step 60, followed by a gradual decline as natural recovery mechanisms take effect. Both intervention scenarios delay the infection peak and reduce its magnitude. The combined intervention flattens the infection curve most substantially, maintaining consistently lower infection levels throughout the simulation duration.</w:t>
+        <w:t>Figure 1 illustrates the time-series evolution of infected nodes and mean vulnerability across all four scenarios. The baseline scenario exhibits a rapid initial rise in infections, peaking around step 60, followed by a gradual decline as natural recovery mechanisms take effect. Both intervention scenarios delay the infection peak and reduce its magnitude. The combined intervention flattens the infection curve most substantially, maintaining consistently lower infection levels throughout the simulation duration.</w:t>
       </w:r>
     </w:p>
     <w:p>
@@ -2203,22 +2203,54 @@
           <w:i/>
           <w:sz w:val="20"/>
         </w:rPr>
-        <w:t>[Figure 1. Time-series of infected nodes across scenarios - see fig_timeseries.png]</w:t>
+      </w:r>
+      <w:r>
+        <w:drawing>
+          <wp:inline xmlns:a="http://schemas.openxmlformats.org/drawingml/2006/main" xmlns:pic="http://schemas.openxmlformats.org/drawingml/2006/picture">
+            <wp:extent cx="4114800" cy="1788609"/>
+            <wp:docPr id="5" name="Picture 5"/>
+            <wp:cNvGraphicFramePr>
+              <a:graphicFrameLocks noChangeAspect="1"/>
+            </wp:cNvGraphicFramePr>
+            <a:graphic>
+              <a:graphicData uri="http://schemas.openxmlformats.org/drawingml/2006/picture">
+                <pic:pic>
+                  <pic:nvPicPr>
+                    <pic:cNvPr id="0" name="fig1_timeseries.png"/>
+                    <pic:cNvPicPr/>
+                  </pic:nvPicPr>
+                  <pic:blipFill>
+                    <a:blip r:embed="rId13"/>
+                    <a:stretch>
+                      <a:fillRect/>
+                    </a:stretch>
+                  </pic:blipFill>
+                  <pic:spPr>
+                    <a:xfrm>
+                      <a:off x="0" y="0"/>
+                      <a:ext cx="4114800" cy="1788609"/>
+                    </a:xfrm>
+                    <a:prstGeom prst="rect"/>
+                  </pic:spPr>
+                </pic:pic>
+              </a:graphicData>
+            </a:graphic>
+          </wp:inline>
+        </w:drawing>
       </w:r>
     </w:p>
     <w:p>
       <w:pPr>
-        <w:spacing w:before="120" w:after="240"/>
         <w:jc w:val="center"/>
+        <w:spacing w:after="120" w:before="60"/>
       </w:pPr>
       <w:r>
         <w:rPr>
-          <w:rFonts w:ascii="Times New Roman" w:hAnsi="Times New Roman" w:eastAsia="Times New Roman"/>
-          <w:b w:val="0"/>
-          <w:i w:val="0"/>
+          <w:rFonts w:ascii="Times New Roman" w:hAnsi="Times New Roman"/>
           <w:sz w:val="22"/>
+          <w:szCs w:val="22"/>
         </w:rPr>
-        <w:t>Figure 1. Time-series of infected nodes across four scenarios over 200 time steps.</w:t>
+        <w:t xml:space="preserve">Figure 1. Time-series of infection and vulnerability dynamics across four intervention scenarios over 200 time steps. Solid lines indicate the mean of 30 Monte Carlo runs; shaded regions represent +/- one standard deviation.</w:t>
       </w:r>
     </w:p>
     <w:p>
@@ -2248,7 +2280,7 @@
           <w:i w:val="0"/>
           <w:sz w:val="22"/>
         </w:rPr>
-        <w:t>The mean vulnerability metric provides insight into the overall security posture of the network. Under baseline conditions, vulnerability hovers around 0.52, reflecting the balance between natural vulnerability decay and external threat introduction. Patch management reduces mean vulnerability to 0.38 (26.9% reduction), while training achieves 0.44 (15.4% reduction). The combined approach achieves the lowest mean vulnerability of 0.31 (40.4% reduction), confirming the compounding effect of layered defenses.</w:t>
+        <w:t>The mean vulnerability metric provides insight into the overall security posture of the network. Under baseline conditions, vulnerability hovers around 0.52, reflecting the balance between natural vulnerability decay and external threat introduction. Patch management reduces mean vulnerability to 0.38 (26.9% reduction), while training achieves 0.44 (15.4% reduction). The combined approach achieves the lowest mean vulnerability of 0.31 (40.4% reduction), confirming the compounding effect of layered defenses. Figure 1(b) visualizes these vulnerability trajectories over the full simulation period.</w:t>
       </w:r>
     </w:p>
     <w:p>
@@ -2263,7 +2295,283 @@
           <w:i w:val="0"/>
           <w:sz w:val="24"/>
         </w:rPr>
-        <w:t>5.4. Statistical Significance</w:t>
+        <w:t>5.4. Intervention Effectiveness</w:t>
+      </w:r>
+    </w:p>
+    <w:p>
+      <w:pPr>
+        <w:spacing w:before="0" w:after="120"/>
+        <w:jc w:val="both"/>
+      </w:pPr>
+      <w:r>
+        <w:rPr>
+          <w:rFonts w:ascii="Times New Roman" w:hAnsi="Times New Roman" w:eastAsia="Times New Roman"/>
+          <w:b w:val="0"/>
+          <w:i w:val="0"/>
+          <w:sz w:val="22"/>
+        </w:rPr>
+        <w:t>Figure 2 presents a comparative analysis of intervention effectiveness. The box plot in panel (a) shows the distribution of peak infection counts across 30 Monte Carlo runs for each scenario. The combined intervention achieves the lowest median and narrowest distribution, indicating both superior and more consistent performance. The bar chart in panel (b) shows the mean infection reduction relative to baseline, with the combined approach achieving 33.3% reduction compared to 20.0% for patch-only and 13.3% for training-only.</w:t>
+      </w:r>
+    </w:p>
+    <w:p>
+      <w:pPr>
+        <w:spacing w:before="120" w:after="120"/>
+        <w:jc w:val="center"/>
+      </w:pPr>
+      <w:r>
+        <w:rPr>
+          <w:rFonts w:ascii="Times New Roman" w:hAnsi="Times New Roman" w:eastAsia="Times New Roman"/>
+          <w:b w:val="0"/>
+          <w:i/>
+          <w:sz w:val="20"/>
+        </w:rPr>
+      </w:r>
+      <w:r>
+        <w:drawing>
+          <wp:inline xmlns:a="http://schemas.openxmlformats.org/drawingml/2006/main" xmlns:pic="http://schemas.openxmlformats.org/drawingml/2006/picture">
+            <wp:extent cx="4114800" cy="1415783"/>
+            <wp:docPr id="4" name="Picture 4"/>
+            <wp:cNvGraphicFramePr>
+              <a:graphicFrameLocks noChangeAspect="1"/>
+            </wp:cNvGraphicFramePr>
+            <a:graphic>
+              <a:graphicData uri="http://schemas.openxmlformats.org/drawingml/2006/picture">
+                <pic:pic>
+                  <pic:nvPicPr>
+                    <pic:cNvPr id="0" name="fig4_network_snapshot.png"/>
+                    <pic:cNvPicPr/>
+                  </pic:nvPicPr>
+                  <pic:blipFill>
+                    <a:blip r:embed="rId12"/>
+                    <a:stretch>
+                      <a:fillRect/>
+                    </a:stretch>
+                  </pic:blipFill>
+                  <pic:spPr>
+                    <a:xfrm>
+                      <a:off x="0" y="0"/>
+                      <a:ext cx="4114800" cy="1415783"/>
+                    </a:xfrm>
+                    <a:prstGeom prst="rect"/>
+                  </pic:spPr>
+                </pic:pic>
+              </a:graphicData>
+            </a:graphic>
+          </wp:inline>
+        </w:drawing>
+      </w:r>
+    </w:p>
+    <w:p>
+      <w:pPr>
+        <w:jc w:val="center"/>
+        <w:spacing w:after="120" w:before="60"/>
+      </w:pPr>
+      <w:r>
+        <w:rPr>
+          <w:rFonts w:ascii="Times New Roman" w:hAnsi="Times New Roman"/>
+          <w:sz w:val="22"/>
+          <w:szCs w:val="22"/>
+        </w:rPr>
+        <w:t xml:space="preserve">Figure 2. Intervention effectiveness comparison. (a) Box plot of peak infection distribution across 30 runs per scenario. (b) Mean infection reduction relative to baseline, with percentage labels.</w:t>
+      </w:r>
+    </w:p>
+    <w:p>
+      <w:pPr>
+        <w:spacing w:before="200" w:after="120"/>
+        <w:jc w:val="left"/>
+      </w:pPr>
+      <w:r>
+        <w:rPr>
+          <w:rFonts w:ascii="Times New Roman" w:hAnsi="Times New Roman" w:eastAsia="Times New Roman"/>
+          <w:b/>
+          <w:i w:val="0"/>
+          <w:sz w:val="24"/>
+        </w:rPr>
+        <w:t>5.5. State Distribution Analysis</w:t>
+      </w:r>
+    </w:p>
+    <w:p>
+      <w:pPr>
+        <w:spacing w:before="0" w:after="120"/>
+        <w:jc w:val="both"/>
+      </w:pPr>
+      <w:r>
+        <w:rPr>
+          <w:rFonts w:ascii="Times New Roman" w:hAnsi="Times New Roman" w:eastAsia="Times New Roman"/>
+          <w:b w:val="0"/>
+          <w:i w:val="0"/>
+          <w:sz w:val="22"/>
+        </w:rPr>
+        <w:t>Figure 3 shows the distribution of node states over time for each scenario using stacked area charts. In the baseline scenario, infected nodes (red) occupy a substantial portion of the network throughout the simulation. Intervention scenarios show progressively larger patched (blue) and recovered (green) proportions, with the combined scenario exhibiting the most favorable state distribution, where protected states dominate from early time steps.</w:t>
+      </w:r>
+    </w:p>
+    <w:p>
+      <w:pPr>
+        <w:spacing w:before="120" w:after="120"/>
+        <w:jc w:val="center"/>
+      </w:pPr>
+      <w:r>
+        <w:rPr>
+          <w:rFonts w:ascii="Times New Roman" w:hAnsi="Times New Roman" w:eastAsia="Times New Roman"/>
+          <w:b w:val="0"/>
+          <w:i/>
+          <w:sz w:val="20"/>
+        </w:rPr>
+      </w:r>
+      <w:r>
+        <w:drawing>
+          <wp:inline xmlns:a="http://schemas.openxmlformats.org/drawingml/2006/main" xmlns:pic="http://schemas.openxmlformats.org/drawingml/2006/picture">
+            <wp:extent cx="4114800" cy="3180426"/>
+            <wp:docPr id="3" name="Picture 3"/>
+            <wp:cNvGraphicFramePr>
+              <a:graphicFrameLocks noChangeAspect="1"/>
+            </wp:cNvGraphicFramePr>
+            <a:graphic>
+              <a:graphicData uri="http://schemas.openxmlformats.org/drawingml/2006/picture">
+                <pic:pic>
+                  <pic:nvPicPr>
+                    <pic:cNvPr id="0" name="fig3_state_distribution.png"/>
+                    <pic:cNvPicPr/>
+                  </pic:nvPicPr>
+                  <pic:blipFill>
+                    <a:blip r:embed="rId11"/>
+                    <a:stretch>
+                      <a:fillRect/>
+                    </a:stretch>
+                  </pic:blipFill>
+                  <pic:spPr>
+                    <a:xfrm>
+                      <a:off x="0" y="0"/>
+                      <a:ext cx="4114800" cy="3180426"/>
+                    </a:xfrm>
+                    <a:prstGeom prst="rect"/>
+                  </pic:spPr>
+                </pic:pic>
+              </a:graphicData>
+            </a:graphic>
+          </wp:inline>
+        </w:drawing>
+      </w:r>
+    </w:p>
+    <w:p>
+      <w:pPr>
+        <w:jc w:val="center"/>
+        <w:spacing w:after="120" w:before="60"/>
+      </w:pPr>
+      <w:r>
+        <w:rPr>
+          <w:rFonts w:ascii="Times New Roman" w:hAnsi="Times New Roman"/>
+          <w:sz w:val="22"/>
+          <w:szCs w:val="22"/>
+        </w:rPr>
+        <w:t xml:space="preserve">Figure 3. Distribution of node states over time for each scenario. Stacked area charts show the mean number of nodes in each state (susceptible, infected, patched, recovered) across 30 Monte Carlo runs.</w:t>
+      </w:r>
+    </w:p>
+    <w:p>
+      <w:pPr>
+        <w:spacing w:before="200" w:after="120"/>
+        <w:jc w:val="left"/>
+      </w:pPr>
+      <w:r>
+        <w:rPr>
+          <w:rFonts w:ascii="Times New Roman" w:hAnsi="Times New Roman" w:eastAsia="Times New Roman"/>
+          <w:b/>
+          <w:i w:val="0"/>
+          <w:sz w:val="24"/>
+        </w:rPr>
+        <w:t>5.6. Network Topology Visualization</w:t>
+      </w:r>
+    </w:p>
+    <w:p>
+      <w:pPr>
+        <w:spacing w:before="0" w:after="120"/>
+        <w:jc w:val="both"/>
+      </w:pPr>
+      <w:r>
+        <w:rPr>
+          <w:rFonts w:ascii="Times New Roman" w:hAnsi="Times New Roman" w:eastAsia="Times New Roman"/>
+          <w:b w:val="0"/>
+          <w:i w:val="0"/>
+          <w:sz w:val="22"/>
+        </w:rPr>
+        <w:t>Figure 4 presents network topology snapshots at multiple time points during the baseline simulation, showing the spatial progression of infections through the network graph. The visualization illustrates how infections preferentially spread through highly connected hub nodes, and how interventions limit this propagation by reducing node vulnerability.</w:t>
+      </w:r>
+    </w:p>
+    <w:p>
+      <w:pPr>
+        <w:spacing w:before="120" w:after="120"/>
+        <w:jc w:val="center"/>
+      </w:pPr>
+      <w:r>
+        <w:rPr>
+          <w:rFonts w:ascii="Times New Roman" w:hAnsi="Times New Roman" w:eastAsia="Times New Roman"/>
+          <w:b w:val="0"/>
+          <w:i/>
+          <w:sz w:val="20"/>
+        </w:rPr>
+      </w:r>
+      <w:r>
+        <w:drawing>
+          <wp:inline xmlns:a="http://schemas.openxmlformats.org/drawingml/2006/main" xmlns:pic="http://schemas.openxmlformats.org/drawingml/2006/picture">
+            <wp:extent cx="4114800" cy="1980009"/>
+            <wp:docPr id="2" name="Picture 2"/>
+            <wp:cNvGraphicFramePr>
+              <a:graphicFrameLocks noChangeAspect="1"/>
+            </wp:cNvGraphicFramePr>
+            <a:graphic>
+              <a:graphicData uri="http://schemas.openxmlformats.org/drawingml/2006/picture">
+                <pic:pic>
+                  <pic:nvPicPr>
+                    <pic:cNvPr id="0" name="fig5_heatmaps.png"/>
+                    <pic:cNvPicPr/>
+                  </pic:nvPicPr>
+                  <pic:blipFill>
+                    <a:blip r:embed="rId10"/>
+                    <a:stretch>
+                      <a:fillRect/>
+                    </a:stretch>
+                  </pic:blipFill>
+                  <pic:spPr>
+                    <a:xfrm>
+                      <a:off x="0" y="0"/>
+                      <a:ext cx="4114800" cy="1980009"/>
+                    </a:xfrm>
+                    <a:prstGeom prst="rect"/>
+                  </pic:spPr>
+                </pic:pic>
+              </a:graphicData>
+            </a:graphic>
+          </wp:inline>
+        </w:drawing>
+      </w:r>
+    </w:p>
+    <w:p>
+      <w:pPr>
+        <w:jc w:val="center"/>
+        <w:spacing w:after="120" w:before="60"/>
+      </w:pPr>
+      <w:r>
+        <w:rPr>
+          <w:rFonts w:ascii="Times New Roman" w:hAnsi="Times New Roman"/>
+          <w:sz w:val="22"/>
+          <w:szCs w:val="22"/>
+        </w:rPr>
+        <w:t xml:space="preserve">Figure 4. Network topology snapshots at four selected time steps for the baseline scenario. Node colors indicate agent states: yellow = susceptible, red = infected, blue = patched, green = recovered.</w:t>
+      </w:r>
+    </w:p>
+    <w:p>
+      <w:pPr>
+        <w:spacing w:before="200" w:after="120"/>
+        <w:jc w:val="left"/>
+      </w:pPr>
+      <w:r>
+        <w:rPr>
+          <w:rFonts w:ascii="Times New Roman" w:hAnsi="Times New Roman" w:eastAsia="Times New Roman"/>
+          <w:b/>
+          <w:i w:val="0"/>
+          <w:sz w:val="24"/>
+        </w:rPr>
+        <w:t>5.7. Statistical Significance</w:t>
       </w:r>
     </w:p>
     <w:p>
@@ -2649,7 +2957,7 @@
           <w:i w:val="0"/>
           <w:sz w:val="24"/>
         </w:rPr>
-        <w:t>5.5. Visualization of Network Topology</w:t>
+        <w:t>5.8. Correlation and Vulnerability Heatmaps</w:t>
       </w:r>
     </w:p>
     <w:p>
@@ -2664,7 +2972,7 @@
           <w:i w:val="0"/>
           <w:sz w:val="22"/>
         </w:rPr>
-        <w:t>Figure 2 presents network topology snapshots at multiple time points during the simulation, showing the spatial progression of infections through the network graph. The visualization illustrates how infections preferentially spread through highly connected hub nodes, and how interventions limit this propagation by reducing node vulnerability.</w:t>
+        <w:t>Figure 5 presents two complementary heatmap analyses. Panel (a) shows the correlation matrix of all simulation variables, revealing expected relationships: infection counts are positively correlated with vulnerability and negatively correlated with patched and recovered state counts. Panel (b) displays the evolution of mean vulnerability across scenarios, sampled every 10 time steps, providing a granular view of how each intervention strategy affects the network security posture over time.</w:t>
       </w:r>
     </w:p>
     <w:p>
@@ -2679,22 +2987,54 @@
           <w:i/>
           <w:sz w:val="20"/>
         </w:rPr>
-        <w:t>[Figure 2. Network topology snapshots - see fig_network_snapshot.png]</w:t>
+      </w:r>
+      <w:r>
+        <w:drawing>
+          <wp:inline xmlns:a="http://schemas.openxmlformats.org/drawingml/2006/main" xmlns:pic="http://schemas.openxmlformats.org/drawingml/2006/picture">
+            <wp:extent cx="4114800" cy="1788609"/>
+            <wp:docPr id="1" name="Picture 1"/>
+            <wp:cNvGraphicFramePr>
+              <a:graphicFrameLocks noChangeAspect="1"/>
+            </wp:cNvGraphicFramePr>
+            <a:graphic>
+              <a:graphicData uri="http://schemas.openxmlformats.org/drawingml/2006/picture">
+                <pic:pic>
+                  <pic:nvPicPr>
+                    <pic:cNvPr id="0" name="fig2_effectiveness.png"/>
+                    <pic:cNvPicPr/>
+                  </pic:nvPicPr>
+                  <pic:blipFill>
+                    <a:blip r:embed="rId9"/>
+                    <a:stretch>
+                      <a:fillRect/>
+                    </a:stretch>
+                  </pic:blipFill>
+                  <pic:spPr>
+                    <a:xfrm>
+                      <a:off x="0" y="0"/>
+                      <a:ext cx="4114800" cy="1788609"/>
+                    </a:xfrm>
+                    <a:prstGeom prst="rect"/>
+                  </pic:spPr>
+                </pic:pic>
+              </a:graphicData>
+            </a:graphic>
+          </wp:inline>
+        </w:drawing>
       </w:r>
     </w:p>
     <w:p>
       <w:pPr>
-        <w:spacing w:before="120" w:after="240"/>
         <w:jc w:val="center"/>
+        <w:spacing w:after="120" w:before="60"/>
       </w:pPr>
       <w:r>
         <w:rPr>
-          <w:rFonts w:ascii="Times New Roman" w:hAnsi="Times New Roman" w:eastAsia="Times New Roman"/>
-          <w:b w:val="0"/>
-          <w:i w:val="0"/>
+          <w:rFonts w:ascii="Times New Roman" w:hAnsi="Times New Roman"/>
           <w:sz w:val="22"/>
+          <w:szCs w:val="22"/>
         </w:rPr>
-        <w:t>Figure 2. Network topology showing infection state at selected time steps.</w:t>
+        <w:t xml:space="preserve">Figure 5. (a) Correlation matrix of key simulation variables showing relationships between state counts and system metrics. (b) Vulnerability evolution heatmap per scenario sampled every 10 time steps.</w:t>
       </w:r>
     </w:p>
     <w:p>

</xml_diff>